<commit_message>
[doc]: update images with saturation blocks that are forgotten in the previous version
</commit_message>
<xml_diff>
--- a/document/entire_system.docx
+++ b/document/entire_system.docx
@@ -6515,14 +6515,13 @@
         <w:rPr>
           <w:i/>
           <w:iCs/>
-          <w:noProof/>
         </w:rPr>
         <w:lastRenderedPageBreak/>
         <w:drawing>
-          <wp:inline distT="0" distB="0" distL="0" distR="0" wp14:anchorId="7D5F8037" wp14:editId="7C9B2CFE">
+          <wp:inline distT="0" distB="0" distL="0" distR="0" wp14:anchorId="01F4B12A" wp14:editId="27D4A634">
             <wp:extent cx="5943600" cy="3343275"/>
             <wp:effectExtent l="0" t="0" r="0" b="9525"/>
-            <wp:docPr id="2012122786" name="Picture 1"/>
+            <wp:docPr id="1935274042" name="Picture 1"/>
             <wp:cNvGraphicFramePr>
               <a:graphicFrameLocks xmlns:a="http://schemas.openxmlformats.org/drawingml/2006/main" noChangeAspect="1"/>
             </wp:cNvGraphicFramePr>
@@ -6530,7 +6529,7 @@
               <a:graphicData uri="http://schemas.openxmlformats.org/drawingml/2006/picture">
                 <pic:pic xmlns:pic="http://schemas.openxmlformats.org/drawingml/2006/picture">
                   <pic:nvPicPr>
-                    <pic:cNvPr id="2012122786" name=""/>
+                    <pic:cNvPr id="1935274042" name=""/>
                     <pic:cNvPicPr/>
                   </pic:nvPicPr>
                   <pic:blipFill>
@@ -6567,13 +6566,12 @@
         <w:rPr>
           <w:i/>
           <w:iCs/>
-          <w:noProof/>
         </w:rPr>
         <w:drawing>
-          <wp:inline distT="0" distB="0" distL="0" distR="0" wp14:anchorId="0D5C56E6" wp14:editId="71593B00">
+          <wp:inline distT="0" distB="0" distL="0" distR="0" wp14:anchorId="6F4D06AE" wp14:editId="7BAD05A9">
             <wp:extent cx="5943600" cy="3343275"/>
             <wp:effectExtent l="0" t="0" r="0" b="9525"/>
-            <wp:docPr id="1318000439" name="Picture 1"/>
+            <wp:docPr id="677573637" name="Picture 1"/>
             <wp:cNvGraphicFramePr>
               <a:graphicFrameLocks xmlns:a="http://schemas.openxmlformats.org/drawingml/2006/main" noChangeAspect="1"/>
             </wp:cNvGraphicFramePr>
@@ -6581,7 +6579,7 @@
               <a:graphicData uri="http://schemas.openxmlformats.org/drawingml/2006/picture">
                 <pic:pic xmlns:pic="http://schemas.openxmlformats.org/drawingml/2006/picture">
                   <pic:nvPicPr>
-                    <pic:cNvPr id="1318000439" name=""/>
+                    <pic:cNvPr id="677573637" name=""/>
                     <pic:cNvPicPr/>
                   </pic:nvPicPr>
                   <pic:blipFill>
@@ -6608,6 +6606,21 @@
     </w:p>
     <w:p>
       <w:pPr>
+        <w:rPr>
+          <w:i/>
+          <w:iCs/>
+        </w:rPr>
+      </w:pPr>
+      <w:r>
+        <w:rPr>
+          <w:i/>
+          <w:iCs/>
+        </w:rPr>
+        <w:br w:type="page"/>
+      </w:r>
+    </w:p>
+    <w:p>
+      <w:pPr>
         <w:jc w:val="center"/>
         <w:rPr>
           <w:i/>
@@ -6619,6 +6632,7 @@
           <w:i/>
           <w:iCs/>
         </w:rPr>
+        <w:lastRenderedPageBreak/>
         <w:t>outer_loop_pi</w:t>
       </w:r>
     </w:p>
@@ -6636,7 +6650,6 @@
           <w:iCs/>
           <w:noProof/>
         </w:rPr>
-        <w:lastRenderedPageBreak/>
         <w:drawing>
           <wp:inline distT="0" distB="0" distL="0" distR="0" wp14:anchorId="79A95E18" wp14:editId="49922274">
             <wp:extent cx="5943600" cy="3343275"/>
@@ -6686,13 +6699,12 @@
         <w:rPr>
           <w:i/>
           <w:iCs/>
-          <w:noProof/>
         </w:rPr>
         <w:drawing>
-          <wp:inline distT="0" distB="0" distL="0" distR="0" wp14:anchorId="4AFE7530" wp14:editId="35FC8F57">
+          <wp:inline distT="0" distB="0" distL="0" distR="0" wp14:anchorId="19CDABDC" wp14:editId="74F5590F">
             <wp:extent cx="5943600" cy="3343275"/>
             <wp:effectExtent l="0" t="0" r="0" b="9525"/>
-            <wp:docPr id="178844363" name="Picture 1"/>
+            <wp:docPr id="795691404" name="Picture 1"/>
             <wp:cNvGraphicFramePr>
               <a:graphicFrameLocks xmlns:a="http://schemas.openxmlformats.org/drawingml/2006/main" noChangeAspect="1"/>
             </wp:cNvGraphicFramePr>
@@ -6700,7 +6712,7 @@
               <a:graphicData uri="http://schemas.openxmlformats.org/drawingml/2006/picture">
                 <pic:pic xmlns:pic="http://schemas.openxmlformats.org/drawingml/2006/picture">
                   <pic:nvPicPr>
-                    <pic:cNvPr id="178844363" name=""/>
+                    <pic:cNvPr id="795691404" name=""/>
                     <pic:cNvPicPr/>
                   </pic:nvPicPr>
                   <pic:blipFill>
@@ -6889,15 +6901,12 @@
         <w:jc w:val="center"/>
       </w:pPr>
       <w:r>
-        <w:rPr>
-          <w:noProof/>
-        </w:rPr>
         <w:lastRenderedPageBreak/>
         <w:drawing>
-          <wp:inline distT="0" distB="0" distL="0" distR="0" wp14:anchorId="09028874" wp14:editId="3DBA4DCA">
+          <wp:inline distT="0" distB="0" distL="0" distR="0" wp14:anchorId="76851B8C" wp14:editId="72BEABB8">
             <wp:extent cx="5943600" cy="3343275"/>
             <wp:effectExtent l="0" t="0" r="0" b="9525"/>
-            <wp:docPr id="1245843005" name="Picture 1"/>
+            <wp:docPr id="219693921" name="Picture 1"/>
             <wp:cNvGraphicFramePr>
               <a:graphicFrameLocks xmlns:a="http://schemas.openxmlformats.org/drawingml/2006/main" noChangeAspect="1"/>
             </wp:cNvGraphicFramePr>
@@ -6905,7 +6914,7 @@
               <a:graphicData uri="http://schemas.openxmlformats.org/drawingml/2006/picture">
                 <pic:pic xmlns:pic="http://schemas.openxmlformats.org/drawingml/2006/picture">
                   <pic:nvPicPr>
-                    <pic:cNvPr id="1245843005" name=""/>
+                    <pic:cNvPr id="219693921" name=""/>
                     <pic:cNvPicPr/>
                   </pic:nvPicPr>
                   <pic:blipFill>
@@ -6935,14 +6944,11 @@
         <w:jc w:val="center"/>
       </w:pPr>
       <w:r>
-        <w:rPr>
-          <w:noProof/>
-        </w:rPr>
         <w:drawing>
-          <wp:inline distT="0" distB="0" distL="0" distR="0" wp14:anchorId="1A9EA218" wp14:editId="5EC2A07E">
+          <wp:inline distT="0" distB="0" distL="0" distR="0" wp14:anchorId="4C0730DC" wp14:editId="14DCED4D">
             <wp:extent cx="5943600" cy="3343275"/>
             <wp:effectExtent l="0" t="0" r="0" b="9525"/>
-            <wp:docPr id="1790411897" name="Picture 1"/>
+            <wp:docPr id="706841549" name="Picture 1"/>
             <wp:cNvGraphicFramePr>
               <a:graphicFrameLocks xmlns:a="http://schemas.openxmlformats.org/drawingml/2006/main" noChangeAspect="1"/>
             </wp:cNvGraphicFramePr>
@@ -6950,7 +6956,7 @@
               <a:graphicData uri="http://schemas.openxmlformats.org/drawingml/2006/picture">
                 <pic:pic xmlns:pic="http://schemas.openxmlformats.org/drawingml/2006/picture">
                   <pic:nvPicPr>
-                    <pic:cNvPr id="1790411897" name=""/>
+                    <pic:cNvPr id="706841549" name=""/>
                     <pic:cNvPicPr/>
                   </pic:nvPicPr>
                   <pic:blipFill>
@@ -15159,6 +15165,7 @@
         <w:rPr>
           <w:b/>
           <w:bCs/>
+          <w:noProof/>
         </w:rPr>
         <w:drawing>
           <wp:inline distT="0" distB="0" distL="0" distR="0" wp14:anchorId="00410F4F" wp14:editId="3176D7F4">
@@ -15209,6 +15216,7 @@
         <w:rPr>
           <w:b/>
           <w:bCs/>
+          <w:noProof/>
         </w:rPr>
         <w:drawing>
           <wp:inline distT="0" distB="0" distL="0" distR="0" wp14:anchorId="1948F005" wp14:editId="1F77A4C8">
@@ -15280,6 +15288,7 @@
         <w:rPr>
           <w:b/>
           <w:bCs/>
+          <w:noProof/>
         </w:rPr>
         <w:lastRenderedPageBreak/>
         <w:drawing>
@@ -15352,6 +15361,7 @@
         <w:rPr>
           <w:b/>
           <w:bCs/>
+          <w:noProof/>
         </w:rPr>
         <w:drawing>
           <wp:inline distT="0" distB="0" distL="0" distR="0" wp14:anchorId="7DF37F30" wp14:editId="6D48C94D">
@@ -15402,6 +15412,7 @@
         <w:rPr>
           <w:b/>
           <w:bCs/>
+          <w:noProof/>
         </w:rPr>
         <w:lastRenderedPageBreak/>
         <w:drawing>
@@ -15453,6 +15464,7 @@
         <w:rPr>
           <w:b/>
           <w:bCs/>
+          <w:noProof/>
         </w:rPr>
         <w:drawing>
           <wp:inline distT="0" distB="0" distL="0" distR="0" wp14:anchorId="36FE8F4F" wp14:editId="6904BE9D">
@@ -15503,6 +15515,7 @@
         <w:rPr>
           <w:b/>
           <w:bCs/>
+          <w:noProof/>
         </w:rPr>
         <w:lastRenderedPageBreak/>
         <w:drawing>
@@ -15554,6 +15567,7 @@
         <w:rPr>
           <w:b/>
           <w:bCs/>
+          <w:noProof/>
         </w:rPr>
         <w:drawing>
           <wp:inline distT="0" distB="0" distL="0" distR="0" wp14:anchorId="25604B8D" wp14:editId="06256519">
@@ -15604,6 +15618,7 @@
         <w:rPr>
           <w:b/>
           <w:bCs/>
+          <w:noProof/>
         </w:rPr>
         <w:drawing>
           <wp:inline distT="0" distB="0" distL="0" distR="0" wp14:anchorId="2C19A538" wp14:editId="45B5D0EB">

</xml_diff>